<commit_message>
Update Module 1.3 assignment document
</commit_message>
<xml_diff>
--- a/module-1/1.3-assignment/csd420_module1-3_assignment.docx
+++ b/module-1/1.3-assignment/csd420_module1-3_assignment.docx
@@ -8,10 +8,8 @@
       </w:pPr>
       <w:r>
         <w:rPr>
-          <w:rFonts w:ascii="Aptos Display" w:hAnsi="Aptos Display"/>
           <w:b/>
-          <w:color w:val="1F4E79"/>
-          <w:sz w:val="44"/>
+          <w:sz w:val="32"/>
         </w:rPr>
         <w:t>CSD 420 Advanced Java Programming</w:t>
       </w:r>
@@ -23,7 +21,7 @@
       <w:r>
         <w:rPr>
           <w:b/>
-          <w:sz w:val="32"/>
+          <w:sz w:val="28"/>
         </w:rPr>
         <w:t>Module 1.3 Programming Assignment</w:t>
       </w:r>
@@ -33,20 +31,25 @@
         <w:jc w:val="center"/>
       </w:pPr>
       <w:r>
-        <w:t>Zak Nizam  |  September 12, 2026</w:t>
+        <w:t>Zak Nizam</w:t>
+      </w:r>
+      <w:r>
+        <w:br/>
+        <w:t>September 12, 2026</w:t>
       </w:r>
     </w:p>
     <w:p>
-      <w:pPr>
-        <w:pStyle w:val="Heading1"/>
-      </w:pPr>
       <w:r>
+        <w:rPr>
+          <w:b/>
+          <w:sz w:val="26"/>
+        </w:rPr>
         <w:t>Java and JavaFX Configuration</w:t>
       </w:r>
     </w:p>
     <w:p>
       <w:r>
-        <w:t>The installed JDK includes the Java compiler and JavaFX modules required to compile and run the card-display application.</w:t>
+        <w:t>The following PowerShell window shows the installed Java version, Java compiler version, and available JavaFX modules.</w:t>
       </w:r>
     </w:p>
     <w:p>
@@ -56,7 +59,7 @@
       <w:r>
         <w:drawing>
           <wp:inline xmlns:a="http://schemas.openxmlformats.org/drawingml/2006/main" xmlns:pic="http://schemas.openxmlformats.org/drawingml/2006/picture">
-            <wp:extent cx="6400800" cy="4538749"/>
+            <wp:extent cx="5943600" cy="3342946"/>
             <wp:docPr id="1" name="Picture 1"/>
             <wp:cNvGraphicFramePr>
               <a:graphicFrameLocks noChangeAspect="1"/>
@@ -65,7 +68,7 @@
               <a:graphicData uri="http://schemas.openxmlformats.org/drawingml/2006/picture">
                 <pic:pic>
                   <pic:nvPicPr>
-                    <pic:cNvPr id="0" name="java-javafx-configuration.png"/>
+                    <pic:cNvPr id="0" name="java-javafx-configuration-actual.png"/>
                     <pic:cNvPicPr/>
                   </pic:nvPicPr>
                   <pic:blipFill>
@@ -77,7 +80,7 @@
                   <pic:spPr>
                     <a:xfrm>
                       <a:off x="0" y="0"/>
-                      <a:ext cx="6400800" cy="4538749"/>
+                      <a:ext cx="5943600" cy="3342946"/>
                     </a:xfrm>
                     <a:prstGeom prst="rect"/>
                   </pic:spPr>
@@ -93,11 +96,7 @@
         <w:jc w:val="center"/>
       </w:pPr>
       <w:r>
-        <w:rPr>
-          <w:i/>
-          <w:sz w:val="18"/>
-        </w:rPr>
-        <w:t>Java 21 and JavaFX 21 installation and configuration verification.</w:t>
+        <w:t>Java and JavaFX configuration in PowerShell</w:t>
       </w:r>
     </w:p>
     <w:p>
@@ -106,16 +105,17 @@
       </w:r>
     </w:p>
     <w:p>
-      <w:pPr>
-        <w:pStyle w:val="Heading1"/>
-      </w:pPr>
       <w:r>
-        <w:t>Initial Random Card Display</w:t>
+        <w:rPr>
+          <w:b/>
+          <w:sz w:val="26"/>
+        </w:rPr>
+        <w:t>Initial Card Display</w:t>
       </w:r>
     </w:p>
     <w:p>
       <w:r>
-        <w:t>At startup, the application randomly selects four unique cards from images 1.png through 52.png in the cards subdirectory.</w:t>
+        <w:t>The program displays four images randomly selected from the 52-card deck.</w:t>
       </w:r>
     </w:p>
     <w:p>
@@ -125,7 +125,7 @@
       <w:r>
         <w:drawing>
           <wp:inline xmlns:a="http://schemas.openxmlformats.org/drawingml/2006/main" xmlns:pic="http://schemas.openxmlformats.org/drawingml/2006/picture">
-            <wp:extent cx="5669280" cy="3631883"/>
+            <wp:extent cx="5303520" cy="3397568"/>
             <wp:docPr id="2" name="Picture 2"/>
             <wp:cNvGraphicFramePr>
               <a:graphicFrameLocks noChangeAspect="1"/>
@@ -146,7 +146,7 @@
                   <pic:spPr>
                     <a:xfrm>
                       <a:off x="0" y="0"/>
-                      <a:ext cx="5669280" cy="3631883"/>
+                      <a:ext cx="5303520" cy="3397568"/>
                     </a:xfrm>
                     <a:prstGeom prst="rect"/>
                   </pic:spPr>
@@ -162,11 +162,7 @@
         <w:jc w:val="center"/>
       </w:pPr>
       <w:r>
-        <w:rPr>
-          <w:i/>
-          <w:sz w:val="18"/>
-        </w:rPr>
-        <w:t>Initial application display containing four randomly selected cards.</w:t>
+        <w:t>Four randomly selected cards when the program starts</w:t>
       </w:r>
     </w:p>
     <w:p>
@@ -175,16 +171,17 @@
       </w:r>
     </w:p>
     <w:p>
-      <w:pPr>
-        <w:pStyle w:val="Heading1"/>
-      </w:pPr>
       <w:r>
-        <w:t>Display After Refresh</w:t>
+        <w:rPr>
+          <w:b/>
+          <w:sz w:val="26"/>
+        </w:rPr>
+        <w:t>Card Display After Refresh</w:t>
       </w:r>
     </w:p>
     <w:p>
       <w:r>
-        <w:t>The Refresh Cards button uses a lambda expression as its action handler. Selecting it replaces every displayed card with a different card.</w:t>
+        <w:t>Selecting the Refresh Cards button displays four different cards. The button action is handled with a lambda expression.</w:t>
       </w:r>
     </w:p>
     <w:p>
@@ -194,7 +191,7 @@
       <w:r>
         <w:drawing>
           <wp:inline xmlns:a="http://schemas.openxmlformats.org/drawingml/2006/main" xmlns:pic="http://schemas.openxmlformats.org/drawingml/2006/picture">
-            <wp:extent cx="5669280" cy="3631883"/>
+            <wp:extent cx="5303520" cy="3397568"/>
             <wp:docPr id="3" name="Picture 3"/>
             <wp:cNvGraphicFramePr>
               <a:graphicFrameLocks noChangeAspect="1"/>
@@ -215,7 +212,7 @@
                   <pic:spPr>
                     <a:xfrm>
                       <a:off x="0" y="0"/>
-                      <a:ext cx="5669280" cy="3631883"/>
+                      <a:ext cx="5303520" cy="3397568"/>
                     </a:xfrm>
                     <a:prstGeom prst="rect"/>
                   </pic:spPr>
@@ -231,29 +228,12 @@
         <w:jc w:val="center"/>
       </w:pPr>
       <w:r>
-        <w:rPr>
-          <w:i/>
-          <w:sz w:val="18"/>
-        </w:rPr>
-        <w:t>All four card images changed after selecting Refresh Cards.</w:t>
-      </w:r>
-    </w:p>
-    <w:p/>
-    <w:p>
-      <w:pPr>
-        <w:jc w:val="center"/>
-      </w:pPr>
-      <w:r>
-        <w:rPr>
-          <w:b/>
-          <w:sz w:val="20"/>
-        </w:rPr>
-        <w:t>Source file: NizamCardDisplay.java  •  Required images verified: 52 of 52</w:t>
+        <w:t>Four different cards displayed after selecting Refresh Cards</w:t>
       </w:r>
     </w:p>
     <w:sectPr>
       <w:pgSz w:w="12240" w:h="15840"/>
-      <w:pgMar w:top="864" w:right="1008" w:bottom="864" w:left="1008" w:header="720" w:footer="720" w:gutter="0"/>
+      <w:pgMar w:top="1440" w:right="1800" w:bottom="1440" w:left="1800" w:header="720" w:footer="720" w:gutter="0"/>
       <w:cols w:space="720"/>
       <w:docGrid w:linePitch="360"/>
     </w:sectPr>
@@ -624,10 +604,6 @@
     <w:name w:val="Normal"/>
     <w:qFormat/>
     <w:rsid w:val="00FC693F"/>
-    <w:rPr>
-      <w:rFonts w:ascii="Aptos" w:hAnsi="Aptos"/>
-      <w:sz w:val="21"/>
-    </w:rPr>
   </w:style>
   <w:style w:type="paragraph" w:styleId="Header">
     <w:name w:val="header"/>

</xml_diff>